<commit_message>
Apply stress-test audit fixes: WCAG AA contrast, a11y, Plato escape, docs
- styles.css: darken --warmth and --ink-faint for WCAG AA contrast; add
  --pass-text/--fail-text badge colours; 44px footer touch targets; screen
  fade-in/Plato-arrival animations; priming countdown styles
- main.js: aria-current=step on active round pip; expand announce() to 14+
  screens; 4s priming delay with countdown; emoji-resistant /\b\w+\b/g word
  count on Iris and Plato gates; skip-to-reflection button on Plato dialogue;
  scenario-specific offline fallbacks; screen fade retrigger on render
- index.html: round tracker nav → div[role=group]; label[for] on Iris textarea
- build_docs.py + docx: add accessibility audit section to handover;
  add Plato offline/skip note to teacher notes; rebuild both docx

Co-Authored-By: Claude Sonnet 4.6 <noreply@anthropic.com>
</commit_message>
<xml_diff>
--- a/handover.docx
+++ b/handover.docx
@@ -967,6 +967,163 @@
           <w:color w:val="B8543C"/>
           <w:sz w:val="28"/>
         </w:rPr>
+        <w:t>Accessibility audit — applied fixes (2026-05-11)</w:t>
+      </w:r>
+    </w:p>
+    <w:p>
+      <w:pPr>
+        <w:spacing w:after="120"/>
+      </w:pPr>
+      <w:r>
+        <w:rPr>
+          <w:rFonts w:ascii="Palatino Linotype" w:hAnsi="Palatino Linotype"/>
+          <w:i w:val="0"/>
+          <w:sz w:val="22"/>
+        </w:rPr>
+        <w:t>Three stress-test agent audits were run against the game. All critical findings are applied. Summary of what was fixed:</w:t>
+      </w:r>
+    </w:p>
+    <w:p>
+      <w:pPr>
+        <w:pStyle w:val="ListBullet"/>
+        <w:spacing w:after="40"/>
+      </w:pPr>
+      <w:r>
+        <w:rPr>
+          <w:rFonts w:ascii="Palatino Linotype" w:hAnsi="Palatino Linotype"/>
+          <w:sz w:val="22"/>
+        </w:rPr>
+        <w:t>WCAG AA contrast — darkened --warmth (#b8543c → #a84835, now 4.61:1) and --ink-faint (#8a7e72 → #6a5e52, now 4.6:1). Badge text colours (--pass-text, --fail-text) added for 4.5:1+ on badge backgrounds.</w:t>
+      </w:r>
+    </w:p>
+    <w:p>
+      <w:pPr>
+        <w:pStyle w:val="ListBullet"/>
+        <w:spacing w:after="40"/>
+      </w:pPr>
+      <w:r>
+        <w:rPr>
+          <w:rFonts w:ascii="Palatino Linotype" w:hAnsi="Palatino Linotype"/>
+          <w:sz w:val="22"/>
+        </w:rPr>
+        <w:t>Touch targets — footer buttons set to min-height: 44px (WCAG 2.2 AA).</w:t>
+      </w:r>
+    </w:p>
+    <w:p>
+      <w:pPr>
+        <w:pStyle w:val="ListBullet"/>
+        <w:spacing w:after="40"/>
+      </w:pPr>
+      <w:r>
+        <w:rPr>
+          <w:rFonts w:ascii="Palatino Linotype" w:hAnsi="Palatino Linotype"/>
+          <w:sz w:val="22"/>
+        </w:rPr>
+        <w:t>Screen reader announcements — announce() calls expanded from 7 to 14+; every screen transition now announces a meaningful status message to the polite live region.</w:t>
+      </w:r>
+    </w:p>
+    <w:p>
+      <w:pPr>
+        <w:pStyle w:val="ListBullet"/>
+        <w:spacing w:after="40"/>
+      </w:pPr>
+      <w:r>
+        <w:rPr>
+          <w:rFonts w:ascii="Palatino Linotype" w:hAnsi="Palatino Linotype"/>
+          <w:sz w:val="22"/>
+        </w:rPr>
+        <w:t>Screen transitions — render() removes/retriggers the fade-in class on every screen change so screen-reader and sighted users get consistent timing cues. Plato arrival uses a 400ms heavy fade; concede screen triggers a scale-in on the h2.</w:t>
+      </w:r>
+    </w:p>
+    <w:p>
+      <w:pPr>
+        <w:pStyle w:val="ListBullet"/>
+        <w:spacing w:after="40"/>
+      </w:pPr>
+      <w:r>
+        <w:rPr>
+          <w:rFonts w:ascii="Palatino Linotype" w:hAnsi="Palatino Linotype"/>
+          <w:sz w:val="22"/>
+        </w:rPr>
+        <w:t>Priming card forced-read delay — Round 4's heads-up card locks the 'Read on' button for 4 seconds with a live countdown. This is a READING TIME, not decorative — the Siegel hijack pedagogy depends on the priming actually landing before students see Sam's words.</w:t>
+      </w:r>
+    </w:p>
+    <w:p>
+      <w:pPr>
+        <w:pStyle w:val="ListBullet"/>
+        <w:spacing w:after="40"/>
+      </w:pPr>
+      <w:r>
+        <w:rPr>
+          <w:rFonts w:ascii="Palatino Linotype" w:hAnsi="Palatino Linotype"/>
+          <w:sz w:val="22"/>
+        </w:rPr>
+        <w:t>Round tracker landmark — changed from &lt;nav&gt; to &lt;div role='group'&gt; (progress pips are not navigation). Added aria-current='step' to the active pip in updateRoundTracker().</w:t>
+      </w:r>
+    </w:p>
+    <w:p>
+      <w:pPr>
+        <w:pStyle w:val="ListBullet"/>
+        <w:spacing w:after="40"/>
+      </w:pPr>
+      <w:r>
+        <w:rPr>
+          <w:rFonts w:ascii="Palatino Linotype" w:hAnsi="Palatino Linotype"/>
+          <w:sz w:val="22"/>
+        </w:rPr>
+        <w:t>Iris textarea labelling — &lt;label for='student-response'&gt; now correctly associated (was aria-label on the textarea, which is weaker than a visible label).</w:t>
+      </w:r>
+    </w:p>
+    <w:p>
+      <w:pPr>
+        <w:pStyle w:val="ListBullet"/>
+        <w:spacing w:after="40"/>
+      </w:pPr>
+      <w:r>
+        <w:rPr>
+          <w:rFonts w:ascii="Palatino Linotype" w:hAnsi="Palatino Linotype"/>
+          <w:sz w:val="22"/>
+        </w:rPr>
+        <w:t>Word-count regex — both Iris's gate and Plato's hard floor use /\b\w+\b/g. A sequence of spaced emoji or punctuation will not pass the count.</w:t>
+      </w:r>
+    </w:p>
+    <w:p>
+      <w:pPr>
+        <w:pStyle w:val="ListBullet"/>
+        <w:spacing w:after="40"/>
+      </w:pPr>
+      <w:r>
+        <w:rPr>
+          <w:rFonts w:ascii="Palatino Linotype" w:hAnsi="Palatino Linotype"/>
+          <w:sz w:val="22"/>
+        </w:rPr>
+        <w:t>Plato skip button — a de-emphasised 'Skip to reflection (offline / teacher)' button sits at the bottom of the Plato dialogue. Visually quiet (small underline link) so engaged students ignore it; present so offline-stuck students or teachers can escape. Requires a browser confirm() to prevent accidental activation.</w:t>
+      </w:r>
+    </w:p>
+    <w:p>
+      <w:pPr>
+        <w:pStyle w:val="ListBullet"/>
+        <w:spacing w:after="40"/>
+      </w:pPr>
+      <w:r>
+        <w:rPr>
+          <w:rFonts w:ascii="Palatino Linotype" w:hAnsi="Palatino Linotype"/>
+          <w:sz w:val="22"/>
+        </w:rPr>
+        <w:t>Plato card vignette — inset box-shadow gives the dialogue card 'colder, denser air' than Iris's warm cards.</w:t>
+      </w:r>
+    </w:p>
+    <w:p>
+      <w:pPr>
+        <w:spacing w:before="280" w:after="80"/>
+      </w:pPr>
+      <w:r>
+        <w:rPr>
+          <w:rFonts w:ascii="Palatino Linotype" w:hAnsi="Palatino Linotype"/>
+          <w:b/>
+          <w:color w:val="B8543C"/>
+          <w:sz w:val="28"/>
+        </w:rPr>
         <w:t>Known small things</w:t>
       </w:r>
     </w:p>

</xml_diff>